<commit_message>
docs(release): M2 测试报告，版本号升至 0.2.0
- 新增 docs/test-report-m2.md：环境、L1/L3 结果（运动 21/21、静态 20/0/1、
  模拟器 19/0/1）、5 个缺陷的复现与修复、架构分层扫描、已知限制
- VERSION 0.1.0 -> 0.2.0（里程碑 = 次版本递增）
- project-intro 里程碑表 M2 标记完成，docs 索引补报告条目
- 重新生成对应 Word 文档

Co-Authored-By: Claude Code <noreply@anthropic.com>
</commit_message>
<xml_diff>
--- a/docs/word/README.docx
+++ b/docs/word/README.docx
@@ -579,6 +579,71 @@
                 <w:sz w:val="18"/>
                 <w:lang w:val="en-US" w:eastAsia="zh-CN"/>
               </w:rPr>
+              <w:t>test-report-m2.md</w:t>
+            </w:r>
+          </w:p>
+        </w:tc>
+        <w:tc>
+          <w:tcPr>
+            <w:tcW w:type="dxa" w:w="3137"/>
+          </w:tcPr>
+          <w:p>
+            <w:pPr>
+              <w:spacing w:before="20" w:after="20"/>
+              <w:jc w:val="left"/>
+            </w:pPr>
+            <w:r>
+              <w:rPr>
+                <w:rFonts w:ascii="Times New Roman" w:hAnsi="Times New Roman" w:eastAsia="宋体"/>
+                <w:b w:val="0"/>
+                <w:sz w:val="18"/>
+                <w:lang w:val="en-US" w:eastAsia="zh-CN"/>
+              </w:rPr>
+              <w:t>M2 节点测试报告：环境、L1/L3 结果、缺陷记录、已知限制</w:t>
+            </w:r>
+          </w:p>
+        </w:tc>
+        <w:tc>
+          <w:tcPr>
+            <w:tcW w:type="dxa" w:w="3137"/>
+          </w:tcPr>
+          <w:p>
+            <w:pPr>
+              <w:spacing w:before="20" w:after="20"/>
+              <w:jc w:val="left"/>
+            </w:pPr>
+            <w:r>
+              <w:rPr>
+                <w:rFonts w:ascii="Times New Roman" w:hAnsi="Times New Roman" w:eastAsia="宋体"/>
+                <w:b w:val="0"/>
+                <w:sz w:val="18"/>
+                <w:lang w:val="en-US" w:eastAsia="zh-CN"/>
+              </w:rPr>
+              <w:t>M2 通过</w:t>
+            </w:r>
+          </w:p>
+        </w:tc>
+      </w:tr>
+      <w:tr>
+        <w:trPr>
+          <w:cantSplit/>
+        </w:trPr>
+        <w:tc>
+          <w:tcPr>
+            <w:tcW w:type="dxa" w:w="3137"/>
+          </w:tcPr>
+          <w:p>
+            <w:pPr>
+              <w:spacing w:before="20" w:after="20"/>
+              <w:jc w:val="left"/>
+            </w:pPr>
+            <w:r>
+              <w:rPr>
+                <w:rFonts w:ascii="Times New Roman" w:hAnsi="Times New Roman" w:eastAsia="宋体"/>
+                <w:b w:val="0"/>
+                <w:sz w:val="18"/>
+                <w:lang w:val="en-US" w:eastAsia="zh-CN"/>
+              </w:rPr>
               <w:t>ai-usage.md</w:t>
             </w:r>
           </w:p>

</xml_diff>